<commit_message>
Polish final report Word document
</commit_message>
<xml_diff>
--- a/reports/final_report_complete.docx
+++ b/reports/final_report_complete.docx
@@ -5,8 +5,15 @@
     <w:p>
       <w:pPr>
         <w:pStyle w:val="Heading1"/>
+        <w:spacing w:before="1920" w:after="480"/>
+        <w:jc w:val="center"/>
       </w:pPr>
       <w:r>
+        <w:rPr>
+          <w:rFonts w:ascii="Calibri" w:hAnsi="Calibri" w:eastAsia="Calibri" w:cs="Calibri"/>
+          <w:color w:val="1F4D78"/>
+          <w:sz w:val="44"/>
+        </w:rPr>
         <w:t>Final Sınavı Proje Raporu</w:t>
       </w:r>
     </w:p>
@@ -79,30 +86,55 @@
     <w:tbl>
       <w:tblPr>
         <w:tblStyle w:val="TableGrid"/>
-        <w:tblW w:type="auto" w:w="0"/>
+        <w:tblW w:type="dxa" w:w="9360"/>
+        <w:jc w:val="left"/>
+        <w:tblLayout w:type="fixed"/>
         <w:tblLook w:firstColumn="1" w:firstRow="1" w:lastColumn="0" w:lastRow="0" w:noHBand="0" w:noVBand="1" w:val="04A0"/>
+        <w:tblInd w:w="120" w:type="dxa"/>
+        <w:tblCellMar>
+          <w:top w:w="80" w:type="dxa"/>
+          <w:bottom w:w="80" w:type="dxa"/>
+          <w:start w:w="120" w:type="dxa"/>
+          <w:end w:w="120" w:type="dxa"/>
+        </w:tblCellMar>
       </w:tblPr>
       <w:tblGrid>
-        <w:gridCol w:w="4968"/>
-        <w:gridCol w:w="4968"/>
+        <w:gridCol w:w="4680"/>
+        <w:gridCol w:w="4680"/>
       </w:tblGrid>
       <w:tr>
         <w:tc>
           <w:tcPr>
-            <w:tcW w:type="dxa" w:w="4968"/>
+            <w:tcW w:type="dxa" w:w="4680"/>
+            <w:shd w:fill="F2F4F7"/>
+            <w:vAlign w:val="top"/>
           </w:tcPr>
           <w:p>
             <w:r>
+              <w:rPr>
+                <w:rFonts w:ascii="Calibri" w:hAnsi="Calibri" w:eastAsia="Calibri" w:cs="Calibri"/>
+                <w:b/>
+                <w:color w:val="0B2545"/>
+                <w:sz w:val="21"/>
+              </w:rPr>
               <w:t>Veri Türü</w:t>
             </w:r>
           </w:p>
         </w:tc>
         <w:tc>
           <w:tcPr>
-            <w:tcW w:type="dxa" w:w="4968"/>
+            <w:tcW w:type="dxa" w:w="4680"/>
+            <w:shd w:fill="F2F4F7"/>
+            <w:vAlign w:val="top"/>
           </w:tcPr>
           <w:p>
             <w:r>
+              <w:rPr>
+                <w:rFonts w:ascii="Calibri" w:hAnsi="Calibri" w:eastAsia="Calibri" w:cs="Calibri"/>
+                <w:b/>
+                <w:color w:val="0B2545"/>
+                <w:sz w:val="21"/>
+              </w:rPr>
               <w:t>Adet</w:t>
             </w:r>
           </w:p>
@@ -111,20 +143,36 @@
       <w:tr>
         <w:tc>
           <w:tcPr>
-            <w:tcW w:type="dxa" w:w="4968"/>
+            <w:tcW w:type="dxa" w:w="4680"/>
+            <w:vAlign w:val="top"/>
           </w:tcPr>
           <w:p>
+            <w:pPr>
+              <w:spacing w:after="60"/>
+            </w:pPr>
             <w:r>
+              <w:rPr>
+                <w:rFonts w:ascii="Calibri" w:hAnsi="Calibri" w:eastAsia="Calibri" w:cs="Calibri"/>
+                <w:sz w:val="20"/>
+              </w:rPr>
               <w:t>Şehir</w:t>
             </w:r>
           </w:p>
         </w:tc>
         <w:tc>
           <w:tcPr>
-            <w:tcW w:type="dxa" w:w="4968"/>
+            <w:tcW w:type="dxa" w:w="4680"/>
+            <w:vAlign w:val="top"/>
           </w:tcPr>
           <w:p>
+            <w:pPr>
+              <w:spacing w:after="60"/>
+            </w:pPr>
             <w:r>
+              <w:rPr>
+                <w:rFonts w:ascii="Calibri" w:hAnsi="Calibri" w:eastAsia="Calibri" w:cs="Calibri"/>
+                <w:sz w:val="20"/>
+              </w:rPr>
               <w:t>3</w:t>
             </w:r>
           </w:p>
@@ -133,20 +181,36 @@
       <w:tr>
         <w:tc>
           <w:tcPr>
-            <w:tcW w:type="dxa" w:w="4968"/>
+            <w:tcW w:type="dxa" w:w="4680"/>
+            <w:vAlign w:val="top"/>
           </w:tcPr>
           <w:p>
+            <w:pPr>
+              <w:spacing w:after="60"/>
+            </w:pPr>
             <w:r>
+              <w:rPr>
+                <w:rFonts w:ascii="Calibri" w:hAnsi="Calibri" w:eastAsia="Calibri" w:cs="Calibri"/>
+                <w:sz w:val="20"/>
+              </w:rPr>
               <w:t>Mekan</w:t>
             </w:r>
           </w:p>
         </w:tc>
         <w:tc>
           <w:tcPr>
-            <w:tcW w:type="dxa" w:w="4968"/>
+            <w:tcW w:type="dxa" w:w="4680"/>
+            <w:vAlign w:val="top"/>
           </w:tcPr>
           <w:p>
+            <w:pPr>
+              <w:spacing w:after="60"/>
+            </w:pPr>
             <w:r>
+              <w:rPr>
+                <w:rFonts w:ascii="Calibri" w:hAnsi="Calibri" w:eastAsia="Calibri" w:cs="Calibri"/>
+                <w:sz w:val="20"/>
+              </w:rPr>
               <w:t>9</w:t>
             </w:r>
           </w:p>
@@ -155,20 +219,36 @@
       <w:tr>
         <w:tc>
           <w:tcPr>
-            <w:tcW w:type="dxa" w:w="4968"/>
+            <w:tcW w:type="dxa" w:w="4680"/>
+            <w:vAlign w:val="top"/>
           </w:tcPr>
           <w:p>
+            <w:pPr>
+              <w:spacing w:after="60"/>
+            </w:pPr>
             <w:r>
+              <w:rPr>
+                <w:rFonts w:ascii="Calibri" w:hAnsi="Calibri" w:eastAsia="Calibri" w:cs="Calibri"/>
+                <w:sz w:val="20"/>
+              </w:rPr>
               <w:t>Strapi Media Library / Cloudinary görseli</w:t>
             </w:r>
           </w:p>
         </w:tc>
         <w:tc>
           <w:tcPr>
-            <w:tcW w:type="dxa" w:w="4968"/>
+            <w:tcW w:type="dxa" w:w="4680"/>
+            <w:vAlign w:val="top"/>
           </w:tcPr>
           <w:p>
+            <w:pPr>
+              <w:spacing w:after="60"/>
+            </w:pPr>
             <w:r>
+              <w:rPr>
+                <w:rFonts w:ascii="Calibri" w:hAnsi="Calibri" w:eastAsia="Calibri" w:cs="Calibri"/>
+                <w:sz w:val="20"/>
+              </w:rPr>
               <w:t>9</w:t>
             </w:r>
           </w:p>
@@ -267,10 +347,14 @@
       </w:r>
     </w:p>
     <w:p>
+      <w:pPr>
+        <w:pStyle w:val="CodeBlock"/>
+        <w:keepLines w:val="0"/>
+      </w:pPr>
       <w:r>
         <w:rPr>
-          <w:rFonts w:ascii="Courier New" w:hAnsi="Courier New"/>
-          <w:sz w:val="17"/>
+          <w:rFonts w:ascii="Consolas" w:hAnsi="Consolas" w:eastAsia="Consolas" w:cs="Consolas"/>
+          <w:sz w:val="14"/>
         </w:rPr>
         <w:t>GET /api/cities</w:t>
         <w:br/>
@@ -297,10 +381,14 @@
       </w:r>
     </w:p>
     <w:p>
+      <w:pPr>
+        <w:pStyle w:val="CodeBlock"/>
+        <w:keepLines w:val="0"/>
+      </w:pPr>
       <w:r>
         <w:rPr>
-          <w:rFonts w:ascii="Courier New" w:hAnsi="Courier New"/>
-          <w:sz w:val="17"/>
+          <w:rFonts w:ascii="Consolas" w:hAnsi="Consolas" w:eastAsia="Consolas" w:cs="Consolas"/>
+          <w:sz w:val="14"/>
         </w:rPr>
         <w:t>flowchart TD</w:t>
         <w:br/>
@@ -436,41 +524,74 @@
     <w:tbl>
       <w:tblPr>
         <w:tblStyle w:val="TableGrid"/>
-        <w:tblW w:type="auto" w:w="0"/>
+        <w:tblW w:type="dxa" w:w="9360"/>
+        <w:jc w:val="left"/>
+        <w:tblLayout w:type="fixed"/>
         <w:tblLook w:firstColumn="1" w:firstRow="1" w:lastColumn="0" w:lastRow="0" w:noHBand="0" w:noVBand="1" w:val="04A0"/>
+        <w:tblInd w:w="120" w:type="dxa"/>
+        <w:tblCellMar>
+          <w:top w:w="80" w:type="dxa"/>
+          <w:bottom w:w="80" w:type="dxa"/>
+          <w:start w:w="120" w:type="dxa"/>
+          <w:end w:w="120" w:type="dxa"/>
+        </w:tblCellMar>
       </w:tblPr>
       <w:tblGrid>
-        <w:gridCol w:w="3312"/>
-        <w:gridCol w:w="3312"/>
-        <w:gridCol w:w="3312"/>
+        <w:gridCol w:w="3120"/>
+        <w:gridCol w:w="3120"/>
+        <w:gridCol w:w="3120"/>
       </w:tblGrid>
       <w:tr>
         <w:tc>
           <w:tcPr>
-            <w:tcW w:type="dxa" w:w="3312"/>
+            <w:tcW w:type="dxa" w:w="3120"/>
+            <w:shd w:fill="F2F4F7"/>
+            <w:vAlign w:val="top"/>
           </w:tcPr>
           <w:p>
             <w:r>
+              <w:rPr>
+                <w:rFonts w:ascii="Calibri" w:hAnsi="Calibri" w:eastAsia="Calibri" w:cs="Calibri"/>
+                <w:b/>
+                <w:color w:val="0B2545"/>
+                <w:sz w:val="21"/>
+              </w:rPr>
               <w:t>Alan</w:t>
             </w:r>
           </w:p>
         </w:tc>
         <w:tc>
           <w:tcPr>
-            <w:tcW w:type="dxa" w:w="3312"/>
+            <w:tcW w:type="dxa" w:w="3120"/>
+            <w:shd w:fill="F2F4F7"/>
+            <w:vAlign w:val="top"/>
           </w:tcPr>
           <w:p>
             <w:r>
+              <w:rPr>
+                <w:rFonts w:ascii="Calibri" w:hAnsi="Calibri" w:eastAsia="Calibri" w:cs="Calibri"/>
+                <w:b/>
+                <w:color w:val="0B2545"/>
+                <w:sz w:val="21"/>
+              </w:rPr>
               <w:t>Tip</w:t>
             </w:r>
           </w:p>
         </w:tc>
         <w:tc>
           <w:tcPr>
-            <w:tcW w:type="dxa" w:w="3312"/>
+            <w:tcW w:type="dxa" w:w="3120"/>
+            <w:shd w:fill="F2F4F7"/>
+            <w:vAlign w:val="top"/>
           </w:tcPr>
           <w:p>
             <w:r>
+              <w:rPr>
+                <w:rFonts w:ascii="Calibri" w:hAnsi="Calibri" w:eastAsia="Calibri" w:cs="Calibri"/>
+                <w:b/>
+                <w:color w:val="0B2545"/>
+                <w:sz w:val="21"/>
+              </w:rPr>
               <w:t>Açıklama</w:t>
             </w:r>
           </w:p>
@@ -479,30 +600,54 @@
       <w:tr>
         <w:tc>
           <w:tcPr>
-            <w:tcW w:type="dxa" w:w="3312"/>
+            <w:tcW w:type="dxa" w:w="3120"/>
+            <w:vAlign w:val="top"/>
           </w:tcPr>
           <w:p>
+            <w:pPr>
+              <w:spacing w:after="60"/>
+            </w:pPr>
             <w:r>
+              <w:rPr>
+                <w:rFonts w:ascii="Calibri" w:hAnsi="Calibri" w:eastAsia="Calibri" w:cs="Calibri"/>
+                <w:sz w:val="20"/>
+              </w:rPr>
               <w:t>name</w:t>
             </w:r>
           </w:p>
         </w:tc>
         <w:tc>
           <w:tcPr>
-            <w:tcW w:type="dxa" w:w="3312"/>
+            <w:tcW w:type="dxa" w:w="3120"/>
+            <w:vAlign w:val="top"/>
           </w:tcPr>
           <w:p>
+            <w:pPr>
+              <w:spacing w:after="60"/>
+            </w:pPr>
             <w:r>
+              <w:rPr>
+                <w:rFonts w:ascii="Calibri" w:hAnsi="Calibri" w:eastAsia="Calibri" w:cs="Calibri"/>
+                <w:sz w:val="20"/>
+              </w:rPr>
               <w:t>Short text</w:t>
             </w:r>
           </w:p>
         </w:tc>
         <w:tc>
           <w:tcPr>
-            <w:tcW w:type="dxa" w:w="3312"/>
+            <w:tcW w:type="dxa" w:w="3120"/>
+            <w:vAlign w:val="top"/>
           </w:tcPr>
           <w:p>
+            <w:pPr>
+              <w:spacing w:after="60"/>
+            </w:pPr>
             <w:r>
+              <w:rPr>
+                <w:rFonts w:ascii="Calibri" w:hAnsi="Calibri" w:eastAsia="Calibri" w:cs="Calibri"/>
+                <w:sz w:val="20"/>
+              </w:rPr>
               <w:t>Şehir adı</w:t>
             </w:r>
           </w:p>
@@ -511,30 +656,54 @@
       <w:tr>
         <w:tc>
           <w:tcPr>
-            <w:tcW w:type="dxa" w:w="3312"/>
+            <w:tcW w:type="dxa" w:w="3120"/>
+            <w:vAlign w:val="top"/>
           </w:tcPr>
           <w:p>
+            <w:pPr>
+              <w:spacing w:after="60"/>
+            </w:pPr>
             <w:r>
+              <w:rPr>
+                <w:rFonts w:ascii="Calibri" w:hAnsi="Calibri" w:eastAsia="Calibri" w:cs="Calibri"/>
+                <w:sz w:val="20"/>
+              </w:rPr>
               <w:t>name_en</w:t>
             </w:r>
           </w:p>
         </w:tc>
         <w:tc>
           <w:tcPr>
-            <w:tcW w:type="dxa" w:w="3312"/>
+            <w:tcW w:type="dxa" w:w="3120"/>
+            <w:vAlign w:val="top"/>
           </w:tcPr>
           <w:p>
+            <w:pPr>
+              <w:spacing w:after="60"/>
+            </w:pPr>
             <w:r>
+              <w:rPr>
+                <w:rFonts w:ascii="Calibri" w:hAnsi="Calibri" w:eastAsia="Calibri" w:cs="Calibri"/>
+                <w:sz w:val="20"/>
+              </w:rPr>
               <w:t>Short text</w:t>
             </w:r>
           </w:p>
         </w:tc>
         <w:tc>
           <w:tcPr>
-            <w:tcW w:type="dxa" w:w="3312"/>
+            <w:tcW w:type="dxa" w:w="3120"/>
+            <w:vAlign w:val="top"/>
           </w:tcPr>
           <w:p>
+            <w:pPr>
+              <w:spacing w:after="60"/>
+            </w:pPr>
             <w:r>
+              <w:rPr>
+                <w:rFonts w:ascii="Calibri" w:hAnsi="Calibri" w:eastAsia="Calibri" w:cs="Calibri"/>
+                <w:sz w:val="20"/>
+              </w:rPr>
               <w:t>Şehir adının İngilizce karşılığı</w:t>
             </w:r>
           </w:p>
@@ -543,30 +712,54 @@
       <w:tr>
         <w:tc>
           <w:tcPr>
-            <w:tcW w:type="dxa" w:w="3312"/>
+            <w:tcW w:type="dxa" w:w="3120"/>
+            <w:vAlign w:val="top"/>
           </w:tcPr>
           <w:p>
+            <w:pPr>
+              <w:spacing w:after="60"/>
+            </w:pPr>
             <w:r>
+              <w:rPr>
+                <w:rFonts w:ascii="Calibri" w:hAnsi="Calibri" w:eastAsia="Calibri" w:cs="Calibri"/>
+                <w:sz w:val="20"/>
+              </w:rPr>
               <w:t>country</w:t>
             </w:r>
           </w:p>
         </w:tc>
         <w:tc>
           <w:tcPr>
-            <w:tcW w:type="dxa" w:w="3312"/>
+            <w:tcW w:type="dxa" w:w="3120"/>
+            <w:vAlign w:val="top"/>
           </w:tcPr>
           <w:p>
+            <w:pPr>
+              <w:spacing w:after="60"/>
+            </w:pPr>
             <w:r>
+              <w:rPr>
+                <w:rFonts w:ascii="Calibri" w:hAnsi="Calibri" w:eastAsia="Calibri" w:cs="Calibri"/>
+                <w:sz w:val="20"/>
+              </w:rPr>
               <w:t>Short text</w:t>
             </w:r>
           </w:p>
         </w:tc>
         <w:tc>
           <w:tcPr>
-            <w:tcW w:type="dxa" w:w="3312"/>
+            <w:tcW w:type="dxa" w:w="3120"/>
+            <w:vAlign w:val="top"/>
           </w:tcPr>
           <w:p>
+            <w:pPr>
+              <w:spacing w:after="60"/>
+            </w:pPr>
             <w:r>
+              <w:rPr>
+                <w:rFonts w:ascii="Calibri" w:hAnsi="Calibri" w:eastAsia="Calibri" w:cs="Calibri"/>
+                <w:sz w:val="20"/>
+              </w:rPr>
               <w:t>Ülke adı</w:t>
             </w:r>
           </w:p>
@@ -575,30 +768,54 @@
       <w:tr>
         <w:tc>
           <w:tcPr>
-            <w:tcW w:type="dxa" w:w="3312"/>
+            <w:tcW w:type="dxa" w:w="3120"/>
+            <w:vAlign w:val="top"/>
           </w:tcPr>
           <w:p>
+            <w:pPr>
+              <w:spacing w:after="60"/>
+            </w:pPr>
             <w:r>
+              <w:rPr>
+                <w:rFonts w:ascii="Calibri" w:hAnsi="Calibri" w:eastAsia="Calibri" w:cs="Calibri"/>
+                <w:sz w:val="20"/>
+              </w:rPr>
               <w:t>country_en</w:t>
             </w:r>
           </w:p>
         </w:tc>
         <w:tc>
           <w:tcPr>
-            <w:tcW w:type="dxa" w:w="3312"/>
+            <w:tcW w:type="dxa" w:w="3120"/>
+            <w:vAlign w:val="top"/>
           </w:tcPr>
           <w:p>
+            <w:pPr>
+              <w:spacing w:after="60"/>
+            </w:pPr>
             <w:r>
+              <w:rPr>
+                <w:rFonts w:ascii="Calibri" w:hAnsi="Calibri" w:eastAsia="Calibri" w:cs="Calibri"/>
+                <w:sz w:val="20"/>
+              </w:rPr>
               <w:t>Short text</w:t>
             </w:r>
           </w:p>
         </w:tc>
         <w:tc>
           <w:tcPr>
-            <w:tcW w:type="dxa" w:w="3312"/>
+            <w:tcW w:type="dxa" w:w="3120"/>
+            <w:vAlign w:val="top"/>
           </w:tcPr>
           <w:p>
+            <w:pPr>
+              <w:spacing w:after="60"/>
+            </w:pPr>
             <w:r>
+              <w:rPr>
+                <w:rFonts w:ascii="Calibri" w:hAnsi="Calibri" w:eastAsia="Calibri" w:cs="Calibri"/>
+                <w:sz w:val="20"/>
+              </w:rPr>
               <w:t>Ülke adının İngilizce karşılığı</w:t>
             </w:r>
           </w:p>
@@ -607,30 +824,54 @@
       <w:tr>
         <w:tc>
           <w:tcPr>
-            <w:tcW w:type="dxa" w:w="3312"/>
+            <w:tcW w:type="dxa" w:w="3120"/>
+            <w:vAlign w:val="top"/>
           </w:tcPr>
           <w:p>
+            <w:pPr>
+              <w:spacing w:after="60"/>
+            </w:pPr>
             <w:r>
+              <w:rPr>
+                <w:rFonts w:ascii="Calibri" w:hAnsi="Calibri" w:eastAsia="Calibri" w:cs="Calibri"/>
+                <w:sz w:val="20"/>
+              </w:rPr>
               <w:t>short_info</w:t>
             </w:r>
           </w:p>
         </w:tc>
         <w:tc>
           <w:tcPr>
-            <w:tcW w:type="dxa" w:w="3312"/>
+            <w:tcW w:type="dxa" w:w="3120"/>
+            <w:vAlign w:val="top"/>
           </w:tcPr>
           <w:p>
+            <w:pPr>
+              <w:spacing w:after="60"/>
+            </w:pPr>
             <w:r>
+              <w:rPr>
+                <w:rFonts w:ascii="Calibri" w:hAnsi="Calibri" w:eastAsia="Calibri" w:cs="Calibri"/>
+                <w:sz w:val="20"/>
+              </w:rPr>
               <w:t>Long text</w:t>
             </w:r>
           </w:p>
         </w:tc>
         <w:tc>
           <w:tcPr>
-            <w:tcW w:type="dxa" w:w="3312"/>
+            <w:tcW w:type="dxa" w:w="3120"/>
+            <w:vAlign w:val="top"/>
           </w:tcPr>
           <w:p>
+            <w:pPr>
+              <w:spacing w:after="60"/>
+            </w:pPr>
             <w:r>
+              <w:rPr>
+                <w:rFonts w:ascii="Calibri" w:hAnsi="Calibri" w:eastAsia="Calibri" w:cs="Calibri"/>
+                <w:sz w:val="20"/>
+              </w:rPr>
               <w:t>Türkçe kısa şehir bilgisi</w:t>
             </w:r>
           </w:p>
@@ -639,30 +880,54 @@
       <w:tr>
         <w:tc>
           <w:tcPr>
-            <w:tcW w:type="dxa" w:w="3312"/>
+            <w:tcW w:type="dxa" w:w="3120"/>
+            <w:vAlign w:val="top"/>
           </w:tcPr>
           <w:p>
+            <w:pPr>
+              <w:spacing w:after="60"/>
+            </w:pPr>
             <w:r>
+              <w:rPr>
+                <w:rFonts w:ascii="Calibri" w:hAnsi="Calibri" w:eastAsia="Calibri" w:cs="Calibri"/>
+                <w:sz w:val="20"/>
+              </w:rPr>
               <w:t>short_info_en</w:t>
             </w:r>
           </w:p>
         </w:tc>
         <w:tc>
           <w:tcPr>
-            <w:tcW w:type="dxa" w:w="3312"/>
+            <w:tcW w:type="dxa" w:w="3120"/>
+            <w:vAlign w:val="top"/>
           </w:tcPr>
           <w:p>
+            <w:pPr>
+              <w:spacing w:after="60"/>
+            </w:pPr>
             <w:r>
+              <w:rPr>
+                <w:rFonts w:ascii="Calibri" w:hAnsi="Calibri" w:eastAsia="Calibri" w:cs="Calibri"/>
+                <w:sz w:val="20"/>
+              </w:rPr>
               <w:t>Long text</w:t>
             </w:r>
           </w:p>
         </w:tc>
         <w:tc>
           <w:tcPr>
-            <w:tcW w:type="dxa" w:w="3312"/>
+            <w:tcW w:type="dxa" w:w="3120"/>
+            <w:vAlign w:val="top"/>
           </w:tcPr>
           <w:p>
+            <w:pPr>
+              <w:spacing w:after="60"/>
+            </w:pPr>
             <w:r>
+              <w:rPr>
+                <w:rFonts w:ascii="Calibri" w:hAnsi="Calibri" w:eastAsia="Calibri" w:cs="Calibri"/>
+                <w:sz w:val="20"/>
+              </w:rPr>
               <w:t>İngilizce kısa şehir bilgisi</w:t>
             </w:r>
           </w:p>
@@ -671,30 +936,54 @@
       <w:tr>
         <w:tc>
           <w:tcPr>
-            <w:tcW w:type="dxa" w:w="3312"/>
+            <w:tcW w:type="dxa" w:w="3120"/>
+            <w:vAlign w:val="top"/>
           </w:tcPr>
           <w:p>
+            <w:pPr>
+              <w:spacing w:after="60"/>
+            </w:pPr>
             <w:r>
+              <w:rPr>
+                <w:rFonts w:ascii="Calibri" w:hAnsi="Calibri" w:eastAsia="Calibri" w:cs="Calibri"/>
+                <w:sz w:val="20"/>
+              </w:rPr>
               <w:t>places</w:t>
             </w:r>
           </w:p>
         </w:tc>
         <w:tc>
           <w:tcPr>
-            <w:tcW w:type="dxa" w:w="3312"/>
+            <w:tcW w:type="dxa" w:w="3120"/>
+            <w:vAlign w:val="top"/>
           </w:tcPr>
           <w:p>
+            <w:pPr>
+              <w:spacing w:after="60"/>
+            </w:pPr>
             <w:r>
+              <w:rPr>
+                <w:rFonts w:ascii="Calibri" w:hAnsi="Calibri" w:eastAsia="Calibri" w:cs="Calibri"/>
+                <w:sz w:val="20"/>
+              </w:rPr>
               <w:t>Relation</w:t>
             </w:r>
           </w:p>
         </w:tc>
         <w:tc>
           <w:tcPr>
-            <w:tcW w:type="dxa" w:w="3312"/>
+            <w:tcW w:type="dxa" w:w="3120"/>
+            <w:vAlign w:val="top"/>
           </w:tcPr>
           <w:p>
+            <w:pPr>
+              <w:spacing w:after="60"/>
+            </w:pPr>
             <w:r>
+              <w:rPr>
+                <w:rFonts w:ascii="Calibri" w:hAnsi="Calibri" w:eastAsia="Calibri" w:cs="Calibri"/>
+                <w:sz w:val="20"/>
+              </w:rPr>
               <w:t>Bir şehrin birden fazla mekanı vardır</w:t>
             </w:r>
           </w:p>
@@ -713,41 +1002,74 @@
     <w:tbl>
       <w:tblPr>
         <w:tblStyle w:val="TableGrid"/>
-        <w:tblW w:type="auto" w:w="0"/>
+        <w:tblW w:type="dxa" w:w="9360"/>
+        <w:jc w:val="left"/>
+        <w:tblLayout w:type="fixed"/>
         <w:tblLook w:firstColumn="1" w:firstRow="1" w:lastColumn="0" w:lastRow="0" w:noHBand="0" w:noVBand="1" w:val="04A0"/>
+        <w:tblInd w:w="120" w:type="dxa"/>
+        <w:tblCellMar>
+          <w:top w:w="80" w:type="dxa"/>
+          <w:bottom w:w="80" w:type="dxa"/>
+          <w:start w:w="120" w:type="dxa"/>
+          <w:end w:w="120" w:type="dxa"/>
+        </w:tblCellMar>
       </w:tblPr>
       <w:tblGrid>
-        <w:gridCol w:w="3312"/>
-        <w:gridCol w:w="3312"/>
-        <w:gridCol w:w="3312"/>
+        <w:gridCol w:w="3120"/>
+        <w:gridCol w:w="3120"/>
+        <w:gridCol w:w="3120"/>
       </w:tblGrid>
       <w:tr>
         <w:tc>
           <w:tcPr>
-            <w:tcW w:type="dxa" w:w="3312"/>
+            <w:tcW w:type="dxa" w:w="3120"/>
+            <w:shd w:fill="F2F4F7"/>
+            <w:vAlign w:val="top"/>
           </w:tcPr>
           <w:p>
             <w:r>
+              <w:rPr>
+                <w:rFonts w:ascii="Calibri" w:hAnsi="Calibri" w:eastAsia="Calibri" w:cs="Calibri"/>
+                <w:b/>
+                <w:color w:val="0B2545"/>
+                <w:sz w:val="21"/>
+              </w:rPr>
               <w:t>Alan</w:t>
             </w:r>
           </w:p>
         </w:tc>
         <w:tc>
           <w:tcPr>
-            <w:tcW w:type="dxa" w:w="3312"/>
+            <w:tcW w:type="dxa" w:w="3120"/>
+            <w:shd w:fill="F2F4F7"/>
+            <w:vAlign w:val="top"/>
           </w:tcPr>
           <w:p>
             <w:r>
+              <w:rPr>
+                <w:rFonts w:ascii="Calibri" w:hAnsi="Calibri" w:eastAsia="Calibri" w:cs="Calibri"/>
+                <w:b/>
+                <w:color w:val="0B2545"/>
+                <w:sz w:val="21"/>
+              </w:rPr>
               <w:t>Tip</w:t>
             </w:r>
           </w:p>
         </w:tc>
         <w:tc>
           <w:tcPr>
-            <w:tcW w:type="dxa" w:w="3312"/>
+            <w:tcW w:type="dxa" w:w="3120"/>
+            <w:shd w:fill="F2F4F7"/>
+            <w:vAlign w:val="top"/>
           </w:tcPr>
           <w:p>
             <w:r>
+              <w:rPr>
+                <w:rFonts w:ascii="Calibri" w:hAnsi="Calibri" w:eastAsia="Calibri" w:cs="Calibri"/>
+                <w:b/>
+                <w:color w:val="0B2545"/>
+                <w:sz w:val="21"/>
+              </w:rPr>
               <w:t>Açıklama</w:t>
             </w:r>
           </w:p>
@@ -756,30 +1078,54 @@
       <w:tr>
         <w:tc>
           <w:tcPr>
-            <w:tcW w:type="dxa" w:w="3312"/>
+            <w:tcW w:type="dxa" w:w="3120"/>
+            <w:vAlign w:val="top"/>
           </w:tcPr>
           <w:p>
+            <w:pPr>
+              <w:spacing w:after="60"/>
+            </w:pPr>
             <w:r>
+              <w:rPr>
+                <w:rFonts w:ascii="Calibri" w:hAnsi="Calibri" w:eastAsia="Calibri" w:cs="Calibri"/>
+                <w:sz w:val="20"/>
+              </w:rPr>
               <w:t>name</w:t>
             </w:r>
           </w:p>
         </w:tc>
         <w:tc>
           <w:tcPr>
-            <w:tcW w:type="dxa" w:w="3312"/>
+            <w:tcW w:type="dxa" w:w="3120"/>
+            <w:vAlign w:val="top"/>
           </w:tcPr>
           <w:p>
+            <w:pPr>
+              <w:spacing w:after="60"/>
+            </w:pPr>
             <w:r>
+              <w:rPr>
+                <w:rFonts w:ascii="Calibri" w:hAnsi="Calibri" w:eastAsia="Calibri" w:cs="Calibri"/>
+                <w:sz w:val="20"/>
+              </w:rPr>
               <w:t>Short text</w:t>
             </w:r>
           </w:p>
         </w:tc>
         <w:tc>
           <w:tcPr>
-            <w:tcW w:type="dxa" w:w="3312"/>
+            <w:tcW w:type="dxa" w:w="3120"/>
+            <w:vAlign w:val="top"/>
           </w:tcPr>
           <w:p>
+            <w:pPr>
+              <w:spacing w:after="60"/>
+            </w:pPr>
             <w:r>
+              <w:rPr>
+                <w:rFonts w:ascii="Calibri" w:hAnsi="Calibri" w:eastAsia="Calibri" w:cs="Calibri"/>
+                <w:sz w:val="20"/>
+              </w:rPr>
               <w:t>Mekan adı</w:t>
             </w:r>
           </w:p>
@@ -788,30 +1134,54 @@
       <w:tr>
         <w:tc>
           <w:tcPr>
-            <w:tcW w:type="dxa" w:w="3312"/>
+            <w:tcW w:type="dxa" w:w="3120"/>
+            <w:vAlign w:val="top"/>
           </w:tcPr>
           <w:p>
+            <w:pPr>
+              <w:spacing w:after="60"/>
+            </w:pPr>
             <w:r>
+              <w:rPr>
+                <w:rFonts w:ascii="Calibri" w:hAnsi="Calibri" w:eastAsia="Calibri" w:cs="Calibri"/>
+                <w:sz w:val="20"/>
+              </w:rPr>
               <w:t>name_en</w:t>
             </w:r>
           </w:p>
         </w:tc>
         <w:tc>
           <w:tcPr>
-            <w:tcW w:type="dxa" w:w="3312"/>
+            <w:tcW w:type="dxa" w:w="3120"/>
+            <w:vAlign w:val="top"/>
           </w:tcPr>
           <w:p>
+            <w:pPr>
+              <w:spacing w:after="60"/>
+            </w:pPr>
             <w:r>
+              <w:rPr>
+                <w:rFonts w:ascii="Calibri" w:hAnsi="Calibri" w:eastAsia="Calibri" w:cs="Calibri"/>
+                <w:sz w:val="20"/>
+              </w:rPr>
               <w:t>Short text</w:t>
             </w:r>
           </w:p>
         </w:tc>
         <w:tc>
           <w:tcPr>
-            <w:tcW w:type="dxa" w:w="3312"/>
+            <w:tcW w:type="dxa" w:w="3120"/>
+            <w:vAlign w:val="top"/>
           </w:tcPr>
           <w:p>
+            <w:pPr>
+              <w:spacing w:after="60"/>
+            </w:pPr>
             <w:r>
+              <w:rPr>
+                <w:rFonts w:ascii="Calibri" w:hAnsi="Calibri" w:eastAsia="Calibri" w:cs="Calibri"/>
+                <w:sz w:val="20"/>
+              </w:rPr>
               <w:t>Mekanın İngilizce adı</w:t>
             </w:r>
           </w:p>
@@ -820,30 +1190,54 @@
       <w:tr>
         <w:tc>
           <w:tcPr>
-            <w:tcW w:type="dxa" w:w="3312"/>
+            <w:tcW w:type="dxa" w:w="3120"/>
+            <w:vAlign w:val="top"/>
           </w:tcPr>
           <w:p>
+            <w:pPr>
+              <w:spacing w:after="60"/>
+            </w:pPr>
             <w:r>
+              <w:rPr>
+                <w:rFonts w:ascii="Calibri" w:hAnsi="Calibri" w:eastAsia="Calibri" w:cs="Calibri"/>
+                <w:sz w:val="20"/>
+              </w:rPr>
               <w:t>description_tr</w:t>
             </w:r>
           </w:p>
         </w:tc>
         <w:tc>
           <w:tcPr>
-            <w:tcW w:type="dxa" w:w="3312"/>
+            <w:tcW w:type="dxa" w:w="3120"/>
+            <w:vAlign w:val="top"/>
           </w:tcPr>
           <w:p>
+            <w:pPr>
+              <w:spacing w:after="60"/>
+            </w:pPr>
             <w:r>
+              <w:rPr>
+                <w:rFonts w:ascii="Calibri" w:hAnsi="Calibri" w:eastAsia="Calibri" w:cs="Calibri"/>
+                <w:sz w:val="20"/>
+              </w:rPr>
               <w:t>Long text</w:t>
             </w:r>
           </w:p>
         </w:tc>
         <w:tc>
           <w:tcPr>
-            <w:tcW w:type="dxa" w:w="3312"/>
+            <w:tcW w:type="dxa" w:w="3120"/>
+            <w:vAlign w:val="top"/>
           </w:tcPr>
           <w:p>
+            <w:pPr>
+              <w:spacing w:after="60"/>
+            </w:pPr>
             <w:r>
+              <w:rPr>
+                <w:rFonts w:ascii="Calibri" w:hAnsi="Calibri" w:eastAsia="Calibri" w:cs="Calibri"/>
+                <w:sz w:val="20"/>
+              </w:rPr>
               <w:t>Türkçe mekan açıklaması</w:t>
             </w:r>
           </w:p>
@@ -852,30 +1246,54 @@
       <w:tr>
         <w:tc>
           <w:tcPr>
-            <w:tcW w:type="dxa" w:w="3312"/>
+            <w:tcW w:type="dxa" w:w="3120"/>
+            <w:vAlign w:val="top"/>
           </w:tcPr>
           <w:p>
+            <w:pPr>
+              <w:spacing w:after="60"/>
+            </w:pPr>
             <w:r>
+              <w:rPr>
+                <w:rFonts w:ascii="Calibri" w:hAnsi="Calibri" w:eastAsia="Calibri" w:cs="Calibri"/>
+                <w:sz w:val="20"/>
+              </w:rPr>
               <w:t>description_en</w:t>
             </w:r>
           </w:p>
         </w:tc>
         <w:tc>
           <w:tcPr>
-            <w:tcW w:type="dxa" w:w="3312"/>
+            <w:tcW w:type="dxa" w:w="3120"/>
+            <w:vAlign w:val="top"/>
           </w:tcPr>
           <w:p>
+            <w:pPr>
+              <w:spacing w:after="60"/>
+            </w:pPr>
             <w:r>
+              <w:rPr>
+                <w:rFonts w:ascii="Calibri" w:hAnsi="Calibri" w:eastAsia="Calibri" w:cs="Calibri"/>
+                <w:sz w:val="20"/>
+              </w:rPr>
               <w:t>Long text</w:t>
             </w:r>
           </w:p>
         </w:tc>
         <w:tc>
           <w:tcPr>
-            <w:tcW w:type="dxa" w:w="3312"/>
+            <w:tcW w:type="dxa" w:w="3120"/>
+            <w:vAlign w:val="top"/>
           </w:tcPr>
           <w:p>
+            <w:pPr>
+              <w:spacing w:after="60"/>
+            </w:pPr>
             <w:r>
+              <w:rPr>
+                <w:rFonts w:ascii="Calibri" w:hAnsi="Calibri" w:eastAsia="Calibri" w:cs="Calibri"/>
+                <w:sz w:val="20"/>
+              </w:rPr>
               <w:t>İngilizce mekan açıklaması</w:t>
             </w:r>
           </w:p>
@@ -884,30 +1302,54 @@
       <w:tr>
         <w:tc>
           <w:tcPr>
-            <w:tcW w:type="dxa" w:w="3312"/>
+            <w:tcW w:type="dxa" w:w="3120"/>
+            <w:vAlign w:val="top"/>
           </w:tcPr>
           <w:p>
+            <w:pPr>
+              <w:spacing w:after="60"/>
+            </w:pPr>
             <w:r>
+              <w:rPr>
+                <w:rFonts w:ascii="Calibri" w:hAnsi="Calibri" w:eastAsia="Calibri" w:cs="Calibri"/>
+                <w:sz w:val="20"/>
+              </w:rPr>
               <w:t>rating</w:t>
             </w:r>
           </w:p>
         </w:tc>
         <w:tc>
           <w:tcPr>
-            <w:tcW w:type="dxa" w:w="3312"/>
+            <w:tcW w:type="dxa" w:w="3120"/>
+            <w:vAlign w:val="top"/>
           </w:tcPr>
           <w:p>
+            <w:pPr>
+              <w:spacing w:after="60"/>
+            </w:pPr>
             <w:r>
+              <w:rPr>
+                <w:rFonts w:ascii="Calibri" w:hAnsi="Calibri" w:eastAsia="Calibri" w:cs="Calibri"/>
+                <w:sz w:val="20"/>
+              </w:rPr>
               <w:t>Decimal</w:t>
             </w:r>
           </w:p>
         </w:tc>
         <w:tc>
           <w:tcPr>
-            <w:tcW w:type="dxa" w:w="3312"/>
+            <w:tcW w:type="dxa" w:w="3120"/>
+            <w:vAlign w:val="top"/>
           </w:tcPr>
           <w:p>
+            <w:pPr>
+              <w:spacing w:after="60"/>
+            </w:pPr>
             <w:r>
+              <w:rPr>
+                <w:rFonts w:ascii="Calibri" w:hAnsi="Calibri" w:eastAsia="Calibri" w:cs="Calibri"/>
+                <w:sz w:val="20"/>
+              </w:rPr>
               <w:t>Mekan puanı</w:t>
             </w:r>
           </w:p>
@@ -916,30 +1358,54 @@
       <w:tr>
         <w:tc>
           <w:tcPr>
-            <w:tcW w:type="dxa" w:w="3312"/>
+            <w:tcW w:type="dxa" w:w="3120"/>
+            <w:vAlign w:val="top"/>
           </w:tcPr>
           <w:p>
+            <w:pPr>
+              <w:spacing w:after="60"/>
+            </w:pPr>
             <w:r>
+              <w:rPr>
+                <w:rFonts w:ascii="Calibri" w:hAnsi="Calibri" w:eastAsia="Calibri" w:cs="Calibri"/>
+                <w:sz w:val="20"/>
+              </w:rPr>
               <w:t>cover_image</w:t>
             </w:r>
           </w:p>
         </w:tc>
         <w:tc>
           <w:tcPr>
-            <w:tcW w:type="dxa" w:w="3312"/>
+            <w:tcW w:type="dxa" w:w="3120"/>
+            <w:vAlign w:val="top"/>
           </w:tcPr>
           <w:p>
+            <w:pPr>
+              <w:spacing w:after="60"/>
+            </w:pPr>
             <w:r>
+              <w:rPr>
+                <w:rFonts w:ascii="Calibri" w:hAnsi="Calibri" w:eastAsia="Calibri" w:cs="Calibri"/>
+                <w:sz w:val="20"/>
+              </w:rPr>
               <w:t>Media, single image</w:t>
             </w:r>
           </w:p>
         </w:tc>
         <w:tc>
           <w:tcPr>
-            <w:tcW w:type="dxa" w:w="3312"/>
+            <w:tcW w:type="dxa" w:w="3120"/>
+            <w:vAlign w:val="top"/>
           </w:tcPr>
           <w:p>
+            <w:pPr>
+              <w:spacing w:after="60"/>
+            </w:pPr>
             <w:r>
+              <w:rPr>
+                <w:rFonts w:ascii="Calibri" w:hAnsi="Calibri" w:eastAsia="Calibri" w:cs="Calibri"/>
+                <w:sz w:val="20"/>
+              </w:rPr>
               <w:t>Mekanın Strapi Media Library'deki kapak görseli</w:t>
             </w:r>
           </w:p>
@@ -948,30 +1414,54 @@
       <w:tr>
         <w:tc>
           <w:tcPr>
-            <w:tcW w:type="dxa" w:w="3312"/>
+            <w:tcW w:type="dxa" w:w="3120"/>
+            <w:vAlign w:val="top"/>
           </w:tcPr>
           <w:p>
+            <w:pPr>
+              <w:spacing w:after="60"/>
+            </w:pPr>
             <w:r>
+              <w:rPr>
+                <w:rFonts w:ascii="Calibri" w:hAnsi="Calibri" w:eastAsia="Calibri" w:cs="Calibri"/>
+                <w:sz w:val="20"/>
+              </w:rPr>
               <w:t>city</w:t>
             </w:r>
           </w:p>
         </w:tc>
         <w:tc>
           <w:tcPr>
-            <w:tcW w:type="dxa" w:w="3312"/>
+            <w:tcW w:type="dxa" w:w="3120"/>
+            <w:vAlign w:val="top"/>
           </w:tcPr>
           <w:p>
+            <w:pPr>
+              <w:spacing w:after="60"/>
+            </w:pPr>
             <w:r>
+              <w:rPr>
+                <w:rFonts w:ascii="Calibri" w:hAnsi="Calibri" w:eastAsia="Calibri" w:cs="Calibri"/>
+                <w:sz w:val="20"/>
+              </w:rPr>
               <w:t>Relation</w:t>
             </w:r>
           </w:p>
         </w:tc>
         <w:tc>
           <w:tcPr>
-            <w:tcW w:type="dxa" w:w="3312"/>
+            <w:tcW w:type="dxa" w:w="3120"/>
+            <w:vAlign w:val="top"/>
           </w:tcPr>
           <w:p>
+            <w:pPr>
+              <w:spacing w:after="60"/>
+            </w:pPr>
             <w:r>
+              <w:rPr>
+                <w:rFonts w:ascii="Calibri" w:hAnsi="Calibri" w:eastAsia="Calibri" w:cs="Calibri"/>
+                <w:sz w:val="20"/>
+              </w:rPr>
               <w:t>Mekanın bağlı olduğu şehir</w:t>
             </w:r>
           </w:p>
@@ -993,10 +1483,14 @@
       </w:r>
     </w:p>
     <w:p>
+      <w:pPr>
+        <w:pStyle w:val="CodeBlock"/>
+        <w:keepLines w:val="0"/>
+      </w:pPr>
       <w:r>
         <w:rPr>
-          <w:rFonts w:ascii="Courier New" w:hAnsi="Courier New"/>
-          <w:sz w:val="17"/>
+          <w:rFonts w:ascii="Consolas" w:hAnsi="Consolas" w:eastAsia="Consolas" w:cs="Consolas"/>
+          <w:sz w:val="14"/>
         </w:rPr>
         <w:t>City 1 ---- N Place</w:t>
       </w:r>
@@ -1007,10 +1501,14 @@
       </w:r>
     </w:p>
     <w:p>
+      <w:pPr>
+        <w:pStyle w:val="CodeBlock"/>
+        <w:keepLines w:val="0"/>
+      </w:pPr>
       <w:r>
         <w:rPr>
-          <w:rFonts w:ascii="Courier New" w:hAnsi="Courier New"/>
-          <w:sz w:val="17"/>
+          <w:rFonts w:ascii="Consolas" w:hAnsi="Consolas" w:eastAsia="Consolas" w:cs="Consolas"/>
+          <w:sz w:val="14"/>
         </w:rPr>
         <w:t>City.places -&gt; oneToMany</w:t>
         <w:br/>
@@ -1054,10 +1552,14 @@
       </w:r>
     </w:p>
     <w:p>
+      <w:pPr>
+        <w:pStyle w:val="CodeBlock"/>
+        <w:keepLines w:val="0"/>
+      </w:pPr>
       <w:r>
         <w:rPr>
-          <w:rFonts w:ascii="Courier New" w:hAnsi="Courier New"/>
-          <w:sz w:val="17"/>
+          <w:rFonts w:ascii="Consolas" w:hAnsi="Consolas" w:eastAsia="Consolas" w:cs="Consolas"/>
+          <w:sz w:val="14"/>
         </w:rPr>
         <w:t>Authorization: Bearer STRAPI_API_TOKEN</w:t>
       </w:r>
@@ -1254,10 +1756,14 @@
       </w:r>
     </w:p>
     <w:p>
+      <w:pPr>
+        <w:pStyle w:val="CodeBlock"/>
+        <w:keepLines w:val="0"/>
+      </w:pPr>
       <w:r>
         <w:rPr>
-          <w:rFonts w:ascii="Courier New" w:hAnsi="Courier New"/>
-          <w:sz w:val="17"/>
+          <w:rFonts w:ascii="Consolas" w:hAnsi="Consolas" w:eastAsia="Consolas" w:cs="Consolas"/>
+          <w:sz w:val="14"/>
         </w:rPr>
         <w:t>https://res.cloudinary.com/dhuumqcno/image/upload/.../ystanbul_ayasofya_camii_....jpg</w:t>
         <w:br/>
@@ -1330,10 +1836,14 @@
       </w:r>
     </w:p>
     <w:p>
+      <w:pPr>
+        <w:pStyle w:val="CodeBlock"/>
+        <w:keepLines w:val="0"/>
+      </w:pPr>
       <w:r>
         <w:rPr>
-          <w:rFonts w:ascii="Courier New" w:hAnsi="Courier New"/>
-          <w:sz w:val="17"/>
+          <w:rFonts w:ascii="Consolas" w:hAnsi="Consolas" w:eastAsia="Consolas" w:cs="Consolas"/>
+          <w:sz w:val="14"/>
         </w:rPr>
         <w:t>Dünyayi Gezayisun AI Rehberuylan</w:t>
       </w:r>
@@ -1357,10 +1867,14 @@
       </w:r>
     </w:p>
     <w:p>
+      <w:pPr>
+        <w:pStyle w:val="CodeBlock"/>
+        <w:keepLines w:val="0"/>
+      </w:pPr>
       <w:r>
         <w:rPr>
-          <w:rFonts w:ascii="Courier New" w:hAnsi="Courier New"/>
-          <w:sz w:val="17"/>
+          <w:rFonts w:ascii="Consolas" w:hAnsi="Consolas" w:eastAsia="Consolas" w:cs="Consolas"/>
+          <w:sz w:val="14"/>
         </w:rPr>
         <w:t>cities_count=3</w:t>
         <w:br/>
@@ -1383,10 +1897,14 @@
       </w:r>
     </w:p>
     <w:p>
+      <w:pPr>
+        <w:pStyle w:val="CodeBlock"/>
+        <w:keepLines w:val="0"/>
+      </w:pPr>
       <w:r>
         <w:rPr>
-          <w:rFonts w:ascii="Courier New" w:hAnsi="Courier New"/>
-          <w:sz w:val="17"/>
+          <w:rFonts w:ascii="Consolas" w:hAnsi="Consolas" w:eastAsia="Consolas" w:cs="Consolas"/>
+          <w:sz w:val="14"/>
         </w:rPr>
         <w:t>cities 3</w:t>
         <w:br/>
@@ -1431,15 +1949,23 @@
       </w:r>
     </w:p>
     <w:p>
+      <w:pPr>
+        <w:pStyle w:val="Callout"/>
+        <w:ind w:left="259" w:right="259"/>
+      </w:pPr>
       <w:r>
         <w:t>Eklenmesi gereken ekran görüntüsü:</w:t>
       </w:r>
     </w:p>
     <w:p>
+      <w:pPr>
+        <w:pStyle w:val="CodeBlock"/>
+        <w:keepLines w:val="0"/>
+      </w:pPr>
       <w:r>
         <w:rPr>
-          <w:rFonts w:ascii="Courier New" w:hAnsi="Courier New"/>
-          <w:sz w:val="17"/>
+          <w:rFonts w:ascii="Consolas" w:hAnsi="Consolas" w:eastAsia="Consolas" w:cs="Consolas"/>
+          <w:sz w:val="14"/>
         </w:rPr>
         <w:t>Strapi Admin &gt; Content-Type Builder &gt; City</w:t>
         <w:br/>
@@ -1455,15 +1981,23 @@
       </w:r>
     </w:p>
     <w:p>
+      <w:pPr>
+        <w:pStyle w:val="Callout"/>
+        <w:ind w:left="259" w:right="259"/>
+      </w:pPr>
       <w:r>
         <w:t>Eklenmesi gereken ekran görüntüsü:</w:t>
       </w:r>
     </w:p>
     <w:p>
+      <w:pPr>
+        <w:pStyle w:val="CodeBlock"/>
+        <w:keepLines w:val="0"/>
+      </w:pPr>
       <w:r>
         <w:rPr>
-          <w:rFonts w:ascii="Courier New" w:hAnsi="Courier New"/>
-          <w:sz w:val="17"/>
+          <w:rFonts w:ascii="Consolas" w:hAnsi="Consolas" w:eastAsia="Consolas" w:cs="Consolas"/>
+          <w:sz w:val="14"/>
         </w:rPr>
         <w:t>Strapi Admin &gt; Content-Type Builder &gt; Place</w:t>
         <w:br/>
@@ -1479,15 +2013,23 @@
       </w:r>
     </w:p>
     <w:p>
+      <w:pPr>
+        <w:pStyle w:val="Callout"/>
+        <w:ind w:left="259" w:right="259"/>
+      </w:pPr>
       <w:r>
         <w:t>Eklenmesi gereken ekran görüntüsü:</w:t>
       </w:r>
     </w:p>
     <w:p>
+      <w:pPr>
+        <w:pStyle w:val="CodeBlock"/>
+        <w:keepLines w:val="0"/>
+      </w:pPr>
       <w:r>
         <w:rPr>
-          <w:rFonts w:ascii="Courier New" w:hAnsi="Courier New"/>
-          <w:sz w:val="17"/>
+          <w:rFonts w:ascii="Consolas" w:hAnsi="Consolas" w:eastAsia="Consolas" w:cs="Consolas"/>
+          <w:sz w:val="14"/>
         </w:rPr>
         <w:t>Python scripti çalışmadan önce Cities / Places listesinin boş hali.</w:t>
       </w:r>
@@ -1498,10 +2040,14 @@
       </w:r>
     </w:p>
     <w:p>
+      <w:pPr>
+        <w:pStyle w:val="CodeBlock"/>
+        <w:keepLines w:val="0"/>
+      </w:pPr>
       <w:r>
         <w:rPr>
-          <w:rFonts w:ascii="Courier New" w:hAnsi="Courier New"/>
-          <w:sz w:val="17"/>
+          <w:rFonts w:ascii="Consolas" w:hAnsi="Consolas" w:eastAsia="Consolas" w:cs="Consolas"/>
+          <w:sz w:val="14"/>
         </w:rPr>
         <w:t>İlk kurulumda Strapi veritabanı boştu. Python otomasyonu çalıştırıldıktan sonra Cities ve Places koleksiyonları otomatik doldurulmuştur.</w:t>
       </w:r>
@@ -1515,15 +2061,23 @@
       </w:r>
     </w:p>
     <w:p>
+      <w:pPr>
+        <w:pStyle w:val="Callout"/>
+        <w:ind w:left="259" w:right="259"/>
+      </w:pPr>
       <w:r>
         <w:t>Eklenmesi gereken ekran görüntüsü:</w:t>
       </w:r>
     </w:p>
     <w:p>
+      <w:pPr>
+        <w:pStyle w:val="CodeBlock"/>
+        <w:keepLines w:val="0"/>
+      </w:pPr>
       <w:r>
         <w:rPr>
-          <w:rFonts w:ascii="Courier New" w:hAnsi="Courier New"/>
-          <w:sz w:val="17"/>
+          <w:rFonts w:ascii="Consolas" w:hAnsi="Consolas" w:eastAsia="Consolas" w:cs="Consolas"/>
+          <w:sz w:val="14"/>
         </w:rPr>
         <w:t>Cities listesinde İstanbul, Paris, Londra kayıtları.</w:t>
         <w:br/>
@@ -1539,15 +2093,23 @@
       </w:r>
     </w:p>
     <w:p>
+      <w:pPr>
+        <w:pStyle w:val="Callout"/>
+        <w:ind w:left="259" w:right="259"/>
+      </w:pPr>
       <w:r>
         <w:t>Eklenmesi gereken ekran görüntüsü:</w:t>
       </w:r>
     </w:p>
     <w:p>
+      <w:pPr>
+        <w:pStyle w:val="CodeBlock"/>
+        <w:keepLines w:val="0"/>
+      </w:pPr>
       <w:r>
         <w:rPr>
-          <w:rFonts w:ascii="Courier New" w:hAnsi="Courier New"/>
-          <w:sz w:val="17"/>
+          <w:rFonts w:ascii="Consolas" w:hAnsi="Consolas" w:eastAsia="Consolas" w:cs="Consolas"/>
+          <w:sz w:val="14"/>
         </w:rPr>
         <w:t>Media Library içinde 9 adet yüklenmiş mekan görseli.</w:t>
       </w:r>
@@ -1561,15 +2123,23 @@
       </w:r>
     </w:p>
     <w:p>
+      <w:pPr>
+        <w:pStyle w:val="Callout"/>
+        <w:ind w:left="259" w:right="259"/>
+      </w:pPr>
       <w:r>
         <w:t>Eklenmesi gereken ekran görüntüsü:</w:t>
       </w:r>
     </w:p>
     <w:p>
+      <w:pPr>
+        <w:pStyle w:val="CodeBlock"/>
+        <w:keepLines w:val="0"/>
+      </w:pPr>
       <w:r>
         <w:rPr>
-          <w:rFonts w:ascii="Courier New" w:hAnsi="Courier New"/>
-          <w:sz w:val="17"/>
+          <w:rFonts w:ascii="Consolas" w:hAnsi="Consolas" w:eastAsia="Consolas" w:cs="Consolas"/>
+          <w:sz w:val="14"/>
         </w:rPr>
         <w:t>Canlı Streamlit sitesinde şehir seçimi, mekan kartları ve görsellerin göründüğü sayfa.</w:t>
       </w:r>
@@ -1606,10 +2176,14 @@
       </w:r>
     </w:p>
     <w:p>
+      <w:pPr>
+        <w:pStyle w:val="CodeBlock"/>
+        <w:keepLines w:val="0"/>
+      </w:pPr>
       <w:r>
         <w:rPr>
-          <w:rFonts w:ascii="Courier New" w:hAnsi="Courier New"/>
-          <w:sz w:val="17"/>
+          <w:rFonts w:ascii="Consolas" w:hAnsi="Consolas" w:eastAsia="Consolas" w:cs="Consolas"/>
+          <w:sz w:val="14"/>
         </w:rPr>
         <w:t>main()</w:t>
       </w:r>
@@ -1718,10 +2292,14 @@
       </w:r>
     </w:p>
     <w:p>
+      <w:pPr>
+        <w:pStyle w:val="CodeBlock"/>
+        <w:keepLines w:val="0"/>
+      </w:pPr>
       <w:r>
         <w:rPr>
-          <w:rFonts w:ascii="Courier New" w:hAnsi="Courier New"/>
-          <w:sz w:val="17"/>
+          <w:rFonts w:ascii="Consolas" w:hAnsi="Consolas" w:eastAsia="Consolas" w:cs="Consolas"/>
+          <w:sz w:val="14"/>
         </w:rPr>
         <w:t>translate_text(text, source="tr", target="en")</w:t>
       </w:r>
@@ -1774,10 +2352,14 @@
       </w:r>
     </w:p>
     <w:p>
+      <w:pPr>
+        <w:pStyle w:val="CodeBlock"/>
+        <w:keepLines w:val="0"/>
+      </w:pPr>
       <w:r>
         <w:rPr>
-          <w:rFonts w:ascii="Courier New" w:hAnsi="Courier New"/>
-          <w:sz w:val="17"/>
+          <w:rFonts w:ascii="Consolas" w:hAnsi="Consolas" w:eastAsia="Consolas" w:cs="Consolas"/>
+          <w:sz w:val="14"/>
         </w:rPr>
         <w:t>enrich_city_info(city_name, country, base_info)</w:t>
         <w:br/>
@@ -1832,10 +2414,14 @@
       </w:r>
     </w:p>
     <w:p>
+      <w:pPr>
+        <w:pStyle w:val="CodeBlock"/>
+        <w:keepLines w:val="0"/>
+      </w:pPr>
       <w:r>
         <w:rPr>
-          <w:rFonts w:ascii="Courier New" w:hAnsi="Courier New"/>
-          <w:sz w:val="17"/>
+          <w:rFonts w:ascii="Consolas" w:hAnsi="Consolas" w:eastAsia="Consolas" w:cs="Consolas"/>
+          <w:sz w:val="14"/>
         </w:rPr>
         <w:t>generate_and_save_image(place_name, city_name, output_dir="images")</w:t>
       </w:r>
@@ -1846,10 +2432,14 @@
       </w:r>
     </w:p>
     <w:p>
+      <w:pPr>
+        <w:pStyle w:val="CodeBlock"/>
+        <w:keepLines w:val="0"/>
+      </w:pPr>
       <w:r>
         <w:rPr>
-          <w:rFonts w:ascii="Courier New" w:hAnsi="Courier New"/>
-          <w:sz w:val="17"/>
+          <w:rFonts w:ascii="Consolas" w:hAnsi="Consolas" w:eastAsia="Consolas" w:cs="Consolas"/>
+          <w:sz w:val="14"/>
         </w:rPr>
         <w:t>slugify(text)</w:t>
         <w:br/>
@@ -1934,10 +2524,14 @@
       </w:r>
     </w:p>
     <w:p>
+      <w:pPr>
+        <w:pStyle w:val="CodeBlock"/>
+        <w:keepLines w:val="0"/>
+      </w:pPr>
       <w:r>
         <w:rPr>
-          <w:rFonts w:ascii="Courier New" w:hAnsi="Courier New"/>
-          <w:sz w:val="17"/>
+          <w:rFonts w:ascii="Consolas" w:hAnsi="Consolas" w:eastAsia="Consolas" w:cs="Consolas"/>
+          <w:sz w:val="14"/>
         </w:rPr>
         <w:t>StrapiAPI</w:t>
       </w:r>
@@ -1948,10 +2542,14 @@
       </w:r>
     </w:p>
     <w:p>
+      <w:pPr>
+        <w:pStyle w:val="CodeBlock"/>
+        <w:keepLines w:val="0"/>
+      </w:pPr>
       <w:r>
         <w:rPr>
-          <w:rFonts w:ascii="Courier New" w:hAnsi="Courier New"/>
-          <w:sz w:val="17"/>
+          <w:rFonts w:ascii="Consolas" w:hAnsi="Consolas" w:eastAsia="Consolas" w:cs="Consolas"/>
+          <w:sz w:val="14"/>
         </w:rPr>
         <w:t>get_or_create_city(...)</w:t>
         <w:br/>
@@ -2032,10 +2630,14 @@
       </w:r>
     </w:p>
     <w:p>
+      <w:pPr>
+        <w:pStyle w:val="CodeBlock"/>
+        <w:keepLines w:val="0"/>
+      </w:pPr>
       <w:r>
         <w:rPr>
-          <w:rFonts w:ascii="Courier New" w:hAnsi="Courier New"/>
-          <w:sz w:val="17"/>
+          <w:rFonts w:ascii="Consolas" w:hAnsi="Consolas" w:eastAsia="Consolas" w:cs="Consolas"/>
+          <w:sz w:val="14"/>
         </w:rPr>
         <w:t>automation/main.py</w:t>
         <w:br/>
@@ -2080,41 +2682,74 @@
     <w:tbl>
       <w:tblPr>
         <w:tblStyle w:val="TableGrid"/>
-        <w:tblW w:type="auto" w:w="0"/>
+        <w:tblW w:type="dxa" w:w="9360"/>
+        <w:jc w:val="left"/>
+        <w:tblLayout w:type="fixed"/>
         <w:tblLook w:firstColumn="1" w:firstRow="1" w:lastColumn="0" w:lastRow="0" w:noHBand="0" w:noVBand="1" w:val="04A0"/>
+        <w:tblInd w:w="120" w:type="dxa"/>
+        <w:tblCellMar>
+          <w:top w:w="80" w:type="dxa"/>
+          <w:bottom w:w="80" w:type="dxa"/>
+          <w:start w:w="120" w:type="dxa"/>
+          <w:end w:w="120" w:type="dxa"/>
+        </w:tblCellMar>
       </w:tblPr>
       <w:tblGrid>
-        <w:gridCol w:w="3312"/>
-        <w:gridCol w:w="3312"/>
-        <w:gridCol w:w="3312"/>
+        <w:gridCol w:w="3120"/>
+        <w:gridCol w:w="3120"/>
+        <w:gridCol w:w="3120"/>
       </w:tblGrid>
       <w:tr>
         <w:tc>
           <w:tcPr>
-            <w:tcW w:type="dxa" w:w="3312"/>
+            <w:tcW w:type="dxa" w:w="3120"/>
+            <w:shd w:fill="F2F4F7"/>
+            <w:vAlign w:val="top"/>
           </w:tcPr>
           <w:p>
             <w:r>
+              <w:rPr>
+                <w:rFonts w:ascii="Calibri" w:hAnsi="Calibri" w:eastAsia="Calibri" w:cs="Calibri"/>
+                <w:b/>
+                <w:color w:val="0B2545"/>
+                <w:sz w:val="21"/>
+              </w:rPr>
               <w:t>Servis</w:t>
             </w:r>
           </w:p>
         </w:tc>
         <w:tc>
           <w:tcPr>
-            <w:tcW w:type="dxa" w:w="3312"/>
+            <w:tcW w:type="dxa" w:w="3120"/>
+            <w:shd w:fill="F2F4F7"/>
+            <w:vAlign w:val="top"/>
           </w:tcPr>
           <w:p>
             <w:r>
+              <w:rPr>
+                <w:rFonts w:ascii="Calibri" w:hAnsi="Calibri" w:eastAsia="Calibri" w:cs="Calibri"/>
+                <w:b/>
+                <w:color w:val="0B2545"/>
+                <w:sz w:val="21"/>
+              </w:rPr>
               <w:t>Teknoloji</w:t>
             </w:r>
           </w:p>
         </w:tc>
         <w:tc>
           <w:tcPr>
-            <w:tcW w:type="dxa" w:w="3312"/>
+            <w:tcW w:type="dxa" w:w="3120"/>
+            <w:shd w:fill="F2F4F7"/>
+            <w:vAlign w:val="top"/>
           </w:tcPr>
           <w:p>
             <w:r>
+              <w:rPr>
+                <w:rFonts w:ascii="Calibri" w:hAnsi="Calibri" w:eastAsia="Calibri" w:cs="Calibri"/>
+                <w:b/>
+                <w:color w:val="0B2545"/>
+                <w:sz w:val="21"/>
+              </w:rPr>
               <w:t>Açıklama</w:t>
             </w:r>
           </w:p>
@@ -2123,30 +2758,54 @@
       <w:tr>
         <w:tc>
           <w:tcPr>
-            <w:tcW w:type="dxa" w:w="3312"/>
+            <w:tcW w:type="dxa" w:w="3120"/>
+            <w:vAlign w:val="top"/>
           </w:tcPr>
           <w:p>
+            <w:pPr>
+              <w:spacing w:after="60"/>
+            </w:pPr>
             <w:r>
+              <w:rPr>
+                <w:rFonts w:ascii="Calibri" w:hAnsi="Calibri" w:eastAsia="Calibri" w:cs="Calibri"/>
+                <w:sz w:val="20"/>
+              </w:rPr>
               <w:t>ai-travel-guide-strapi</w:t>
             </w:r>
           </w:p>
         </w:tc>
         <w:tc>
           <w:tcPr>
-            <w:tcW w:type="dxa" w:w="3312"/>
+            <w:tcW w:type="dxa" w:w="3120"/>
+            <w:vAlign w:val="top"/>
           </w:tcPr>
           <w:p>
+            <w:pPr>
+              <w:spacing w:after="60"/>
+            </w:pPr>
             <w:r>
+              <w:rPr>
+                <w:rFonts w:ascii="Calibri" w:hAnsi="Calibri" w:eastAsia="Calibri" w:cs="Calibri"/>
+                <w:sz w:val="20"/>
+              </w:rPr>
               <w:t>Node.js / Strapi</w:t>
             </w:r>
           </w:p>
         </w:tc>
         <w:tc>
           <w:tcPr>
-            <w:tcW w:type="dxa" w:w="3312"/>
+            <w:tcW w:type="dxa" w:w="3120"/>
+            <w:vAlign w:val="top"/>
           </w:tcPr>
           <w:p>
+            <w:pPr>
+              <w:spacing w:after="60"/>
+            </w:pPr>
             <w:r>
+              <w:rPr>
+                <w:rFonts w:ascii="Calibri" w:hAnsi="Calibri" w:eastAsia="Calibri" w:cs="Calibri"/>
+                <w:sz w:val="20"/>
+              </w:rPr>
               <w:t>Backend ve CMS</w:t>
             </w:r>
           </w:p>
@@ -2155,30 +2814,54 @@
       <w:tr>
         <w:tc>
           <w:tcPr>
-            <w:tcW w:type="dxa" w:w="3312"/>
+            <w:tcW w:type="dxa" w:w="3120"/>
+            <w:vAlign w:val="top"/>
           </w:tcPr>
           <w:p>
+            <w:pPr>
+              <w:spacing w:after="60"/>
+            </w:pPr>
             <w:r>
+              <w:rPr>
+                <w:rFonts w:ascii="Calibri" w:hAnsi="Calibri" w:eastAsia="Calibri" w:cs="Calibri"/>
+                <w:sz w:val="20"/>
+              </w:rPr>
               <w:t>ai-travel-guide-frontend</w:t>
             </w:r>
           </w:p>
         </w:tc>
         <w:tc>
           <w:tcPr>
-            <w:tcW w:type="dxa" w:w="3312"/>
+            <w:tcW w:type="dxa" w:w="3120"/>
+            <w:vAlign w:val="top"/>
           </w:tcPr>
           <w:p>
+            <w:pPr>
+              <w:spacing w:after="60"/>
+            </w:pPr>
             <w:r>
+              <w:rPr>
+                <w:rFonts w:ascii="Calibri" w:hAnsi="Calibri" w:eastAsia="Calibri" w:cs="Calibri"/>
+                <w:sz w:val="20"/>
+              </w:rPr>
               <w:t>Python / Streamlit</w:t>
             </w:r>
           </w:p>
         </w:tc>
         <w:tc>
           <w:tcPr>
-            <w:tcW w:type="dxa" w:w="3312"/>
+            <w:tcW w:type="dxa" w:w="3120"/>
+            <w:vAlign w:val="top"/>
           </w:tcPr>
           <w:p>
+            <w:pPr>
+              <w:spacing w:after="60"/>
+            </w:pPr>
             <w:r>
+              <w:rPr>
+                <w:rFonts w:ascii="Calibri" w:hAnsi="Calibri" w:eastAsia="Calibri" w:cs="Calibri"/>
+                <w:sz w:val="20"/>
+              </w:rPr>
               <w:t>Kullanıcı arayüzü</w:t>
             </w:r>
           </w:p>
@@ -2187,30 +2870,54 @@
       <w:tr>
         <w:tc>
           <w:tcPr>
-            <w:tcW w:type="dxa" w:w="3312"/>
+            <w:tcW w:type="dxa" w:w="3120"/>
+            <w:vAlign w:val="top"/>
           </w:tcPr>
           <w:p>
+            <w:pPr>
+              <w:spacing w:after="60"/>
+            </w:pPr>
             <w:r>
+              <w:rPr>
+                <w:rFonts w:ascii="Calibri" w:hAnsi="Calibri" w:eastAsia="Calibri" w:cs="Calibri"/>
+                <w:sz w:val="20"/>
+              </w:rPr>
               <w:t>ai-travel-guide-db</w:t>
             </w:r>
           </w:p>
         </w:tc>
         <w:tc>
           <w:tcPr>
-            <w:tcW w:type="dxa" w:w="3312"/>
+            <w:tcW w:type="dxa" w:w="3120"/>
+            <w:vAlign w:val="top"/>
           </w:tcPr>
           <w:p>
+            <w:pPr>
+              <w:spacing w:after="60"/>
+            </w:pPr>
             <w:r>
+              <w:rPr>
+                <w:rFonts w:ascii="Calibri" w:hAnsi="Calibri" w:eastAsia="Calibri" w:cs="Calibri"/>
+                <w:sz w:val="20"/>
+              </w:rPr>
               <w:t>PostgreSQL</w:t>
             </w:r>
           </w:p>
         </w:tc>
         <w:tc>
           <w:tcPr>
-            <w:tcW w:type="dxa" w:w="3312"/>
+            <w:tcW w:type="dxa" w:w="3120"/>
+            <w:vAlign w:val="top"/>
           </w:tcPr>
           <w:p>
+            <w:pPr>
+              <w:spacing w:after="60"/>
+            </w:pPr>
             <w:r>
+              <w:rPr>
+                <w:rFonts w:ascii="Calibri" w:hAnsi="Calibri" w:eastAsia="Calibri" w:cs="Calibri"/>
+                <w:sz w:val="20"/>
+              </w:rPr>
               <w:t>Strapi veritabanı</w:t>
             </w:r>
           </w:p>
@@ -2224,10 +2931,14 @@
       </w:r>
     </w:p>
     <w:p>
+      <w:pPr>
+        <w:pStyle w:val="CodeBlock"/>
+        <w:keepLines w:val="0"/>
+      </w:pPr>
       <w:r>
         <w:rPr>
-          <w:rFonts w:ascii="Courier New" w:hAnsi="Courier New"/>
-          <w:sz w:val="17"/>
+          <w:rFonts w:ascii="Consolas" w:hAnsi="Consolas" w:eastAsia="Consolas" w:cs="Consolas"/>
+          <w:sz w:val="14"/>
         </w:rPr>
         <w:t>DATABASE_CLIENT=postgres</w:t>
         <w:br/>
@@ -2250,10 +2961,14 @@
       </w:r>
     </w:p>
     <w:p>
+      <w:pPr>
+        <w:pStyle w:val="CodeBlock"/>
+        <w:keepLines w:val="0"/>
+      </w:pPr>
       <w:r>
         <w:rPr>
-          <w:rFonts w:ascii="Courier New" w:hAnsi="Courier New"/>
-          <w:sz w:val="17"/>
+          <w:rFonts w:ascii="Consolas" w:hAnsi="Consolas" w:eastAsia="Consolas" w:cs="Consolas"/>
+          <w:sz w:val="14"/>
         </w:rPr>
         <w:t>STRAPI_URL=https://ai-travel-guide-strapi.onrender.com</w:t>
         <w:br/>
@@ -2297,6 +3012,11 @@
       </w:r>
     </w:p>
     <w:p>
+      <w:r>
+        <w:br w:type="page"/>
+      </w:r>
+    </w:p>
+    <w:p>
       <w:pPr>
         <w:pStyle w:val="Heading2"/>
       </w:pPr>
@@ -2305,10 +3025,14 @@
       </w:r>
     </w:p>
     <w:p>
+      <w:pPr>
+        <w:pStyle w:val="CodeBlock"/>
+        <w:keepLines w:val="0"/>
+      </w:pPr>
       <w:r>
         <w:rPr>
-          <w:rFonts w:ascii="Courier New" w:hAnsi="Courier New"/>
-          <w:sz w:val="15"/>
+          <w:rFonts w:ascii="Consolas" w:hAnsi="Consolas" w:eastAsia="Consolas" w:cs="Consolas"/>
+          <w:sz w:val="13"/>
         </w:rPr>
         <w:t>import os</w:t>
         <w:br/>
@@ -2594,6 +3318,11 @@
         <w:t>if __name__ == "__main__":</w:t>
         <w:br/>
         <w:t xml:space="preserve">    main()</w:t>
+      </w:r>
+    </w:p>
+    <w:p>
+      <w:r>
+        <w:br w:type="page"/>
       </w:r>
     </w:p>
     <w:p>
@@ -2605,10 +3334,14 @@
       </w:r>
     </w:p>
     <w:p>
+      <w:pPr>
+        <w:pStyle w:val="CodeBlock"/>
+        <w:keepLines w:val="0"/>
+      </w:pPr>
       <w:r>
         <w:rPr>
-          <w:rFonts w:ascii="Courier New" w:hAnsi="Courier New"/>
-          <w:sz w:val="17"/>
+          <w:rFonts w:ascii="Consolas" w:hAnsi="Consolas" w:eastAsia="Consolas" w:cs="Consolas"/>
+          <w:sz w:val="14"/>
         </w:rPr>
         <w:t>import logging</w:t>
         <w:br/>
@@ -2682,6 +3415,11 @@
         <w:t xml:space="preserve">    print(f"Original (TR): {test_tr}")</w:t>
         <w:br/>
         <w:t xml:space="preserve">    print(f"Translated (EN): {test_en}")</w:t>
+      </w:r>
+    </w:p>
+    <w:p>
+      <w:r>
+        <w:br w:type="page"/>
       </w:r>
     </w:p>
     <w:p>
@@ -2693,10 +3431,14 @@
       </w:r>
     </w:p>
     <w:p>
+      <w:pPr>
+        <w:pStyle w:val="CodeBlock"/>
+        <w:keepLines w:val="0"/>
+      </w:pPr>
       <w:r>
         <w:rPr>
-          <w:rFonts w:ascii="Courier New" w:hAnsi="Courier New"/>
-          <w:sz w:val="15"/>
+          <w:rFonts w:ascii="Consolas" w:hAnsi="Consolas" w:eastAsia="Consolas" w:cs="Consolas"/>
+          <w:sz w:val="13"/>
         </w:rPr>
         <w:t>import logging</w:t>
         <w:br/>
@@ -3031,6 +3773,11 @@
         <w:t xml:space="preserve">    )</w:t>
         <w:br/>
         <w:t xml:space="preserve">    print(sample)</w:t>
+      </w:r>
+    </w:p>
+    <w:p>
+      <w:r>
+        <w:br w:type="page"/>
       </w:r>
     </w:p>
     <w:p>
@@ -3042,10 +3789,14 @@
       </w:r>
     </w:p>
     <w:p>
+      <w:pPr>
+        <w:pStyle w:val="CodeBlock"/>
+        <w:keepLines w:val="0"/>
+      </w:pPr>
       <w:r>
         <w:rPr>
-          <w:rFonts w:ascii="Courier New" w:hAnsi="Courier New"/>
-          <w:sz w:val="15"/>
+          <w:rFonts w:ascii="Consolas" w:hAnsi="Consolas" w:eastAsia="Consolas" w:cs="Consolas"/>
+          <w:sz w:val="13"/>
         </w:rPr>
         <w:t>import os</w:t>
         <w:br/>
@@ -3496,6 +4247,11 @@
         <w:t xml:space="preserve">    img_path = generate_and_save_image("Galata Kulesi", "İstanbul")</w:t>
         <w:br/>
         <w:t xml:space="preserve">    print(f"Generated Image Path: {img_path}")</w:t>
+      </w:r>
+    </w:p>
+    <w:p>
+      <w:r>
+        <w:br w:type="page"/>
       </w:r>
     </w:p>
     <w:p>
@@ -3507,10 +4263,14 @@
       </w:r>
     </w:p>
     <w:p>
+      <w:pPr>
+        <w:pStyle w:val="CodeBlock"/>
+        <w:keepLines w:val="0"/>
+      </w:pPr>
       <w:r>
         <w:rPr>
-          <w:rFonts w:ascii="Courier New" w:hAnsi="Courier New"/>
-          <w:sz w:val="15"/>
+          <w:rFonts w:ascii="Consolas" w:hAnsi="Consolas" w:eastAsia="Consolas" w:cs="Consolas"/>
+          <w:sz w:val="13"/>
         </w:rPr>
         <w:t>import os</w:t>
         <w:br/>
@@ -4228,6 +4988,11 @@
         <w:t xml:space="preserve">    api = StrapiAPI()</w:t>
         <w:br/>
         <w:t xml:space="preserve">    print("Strapi Client initialized. Base URL:", api.api_url)</w:t>
+      </w:r>
+    </w:p>
+    <w:p>
+      <w:r>
+        <w:br w:type="page"/>
       </w:r>
     </w:p>
     <w:p>
@@ -4239,10 +5004,14 @@
       </w:r>
     </w:p>
     <w:p>
+      <w:pPr>
+        <w:pStyle w:val="CodeBlock"/>
+        <w:keepLines w:val="0"/>
+      </w:pPr>
       <w:r>
         <w:rPr>
-          <w:rFonts w:ascii="Courier New" w:hAnsi="Courier New"/>
-          <w:sz w:val="17"/>
+          <w:rFonts w:ascii="Consolas" w:hAnsi="Consolas" w:eastAsia="Consolas" w:cs="Consolas"/>
+          <w:sz w:val="14"/>
         </w:rPr>
         <w:t>[</w:t>
         <w:br/>
@@ -4394,13 +5163,33 @@
       </w:r>
     </w:p>
     <w:sectPr>
+      <w:footerReference w:type="default" r:id="rId9"/>
       <w:pgSz w:w="12240" w:h="15840"/>
-      <w:pgMar w:top="1080" w:right="1152" w:bottom="1080" w:left="1152" w:header="720" w:footer="720" w:gutter="0"/>
+      <w:pgMar w:top="1440" w:right="1440" w:bottom="1440" w:left="1440" w:header="708" w:footer="708" w:gutter="0"/>
       <w:cols w:space="720"/>
       <w:docGrid w:linePitch="360"/>
     </w:sectPr>
   </w:body>
 </w:document>
+</file>
+
+<file path=word/footer1.xml><?xml version="1.0" encoding="utf-8"?>
+<w:ftr xmlns:m="http://schemas.openxmlformats.org/officeDocument/2006/math" xmlns:mc="http://schemas.openxmlformats.org/markup-compatibility/2006" xmlns:mo="http://schemas.microsoft.com/office/mac/office/2008/main" xmlns:mv="urn:schemas-microsoft-com:mac:vml" xmlns:o="urn:schemas-microsoft-com:office:office" xmlns:r="http://schemas.openxmlformats.org/officeDocument/2006/relationships" xmlns:v="urn:schemas-microsoft-com:vml" xmlns:w10="urn:schemas-microsoft-com:office:word" xmlns:w14="http://schemas.microsoft.com/office/word/2010/wordml" xmlns:w="http://schemas.openxmlformats.org/wordprocessingml/2006/main" xmlns:wne="http://schemas.microsoft.com/office/word/2006/wordml" xmlns:wp14="http://schemas.microsoft.com/office/word/2010/wordprocessingDrawing" xmlns:wp="http://schemas.openxmlformats.org/drawingml/2006/wordprocessingDrawing" xmlns:wpc="http://schemas.microsoft.com/office/word/2010/wordprocessingCanvas" xmlns:wpg="http://schemas.microsoft.com/office/word/2010/wordprocessingGroup" xmlns:wpi="http://schemas.microsoft.com/office/word/2010/wordprocessingInk" xmlns:wps="http://schemas.microsoft.com/office/word/2010/wordprocessingShape" mc:Ignorable="w14 wp14">
+  <w:p>
+    <w:pPr>
+      <w:pStyle w:val="Footer"/>
+      <w:jc w:val="right"/>
+    </w:pPr>
+    <w:r>
+      <w:rPr>
+        <w:rFonts w:ascii="Calibri" w:hAnsi="Calibri" w:eastAsia="Calibri" w:cs="Calibri"/>
+        <w:color w:val="666666"/>
+        <w:sz w:val="16"/>
+      </w:rPr>
+      <w:t>Dünyayi Gezayisun AI Rehberuylan</w:t>
+    </w:r>
+  </w:p>
+</w:ftr>
 </file>
 
 <file path=word/numbering.xml><?xml version="1.0" encoding="utf-8"?>
@@ -4766,9 +5555,12 @@
     <w:name w:val="Normal"/>
     <w:qFormat/>
     <w:rsid w:val="00FC693F"/>
+    <w:pPr>
+      <w:spacing w:before="0" w:after="120" w:line="264" w:lineRule="auto"/>
+    </w:pPr>
     <w:rPr>
-      <w:rFonts w:ascii="Arial" w:hAnsi="Arial"/>
-      <w:sz w:val="20"/>
+      <w:rFonts w:ascii="Calibri" w:hAnsi="Calibri"/>
+      <w:sz w:val="22"/>
     </w:rPr>
   </w:style>
   <w:style w:type="paragraph" w:styleId="Header">
@@ -4826,15 +5618,15 @@
     <w:pPr>
       <w:keepNext/>
       <w:keepLines/>
-      <w:spacing w:before="480" w:after="0"/>
+      <w:spacing w:before="320" w:after="160" w:line="264" w:lineRule="auto"/>
       <w:outlineLvl w:val="0"/>
     </w:pPr>
     <w:rPr>
-      <w:rFonts w:asciiTheme="majorHAnsi" w:eastAsiaTheme="majorEastAsia" w:hAnsiTheme="majorHAnsi" w:cstheme="majorBidi" w:ascii="Arial" w:hAnsi="Arial"/>
+      <w:rFonts w:asciiTheme="majorHAnsi" w:eastAsiaTheme="majorEastAsia" w:hAnsiTheme="majorHAnsi" w:cstheme="majorBidi" w:ascii="Calibri" w:hAnsi="Calibri"/>
       <w:b/>
       <w:bCs/>
-      <w:color w:val="365F91" w:themeColor="accent1" w:themeShade="BF"/>
-      <w:sz w:val="36"/>
+      <w:color w:val="2E74B5"/>
+      <w:sz w:val="32"/>
       <w:szCs w:val="28"/>
     </w:rPr>
   </w:style>
@@ -4850,15 +5642,15 @@
     <w:pPr>
       <w:keepNext/>
       <w:keepLines/>
-      <w:spacing w:before="200" w:after="0"/>
+      <w:spacing w:before="240" w:after="120" w:line="264" w:lineRule="auto"/>
       <w:outlineLvl w:val="1"/>
     </w:pPr>
     <w:rPr>
-      <w:rFonts w:asciiTheme="majorHAnsi" w:eastAsiaTheme="majorEastAsia" w:hAnsiTheme="majorHAnsi" w:cstheme="majorBidi" w:ascii="Arial" w:hAnsi="Arial"/>
+      <w:rFonts w:asciiTheme="majorHAnsi" w:eastAsiaTheme="majorEastAsia" w:hAnsiTheme="majorHAnsi" w:cstheme="majorBidi" w:ascii="Calibri" w:hAnsi="Calibri"/>
       <w:b/>
       <w:bCs/>
-      <w:color w:val="4F81BD" w:themeColor="accent1"/>
-      <w:sz w:val="28"/>
+      <w:color w:val="2E74B5"/>
+      <w:sz w:val="26"/>
       <w:szCs w:val="26"/>
     </w:rPr>
   </w:style>
@@ -4874,14 +5666,14 @@
     <w:pPr>
       <w:keepNext/>
       <w:keepLines/>
-      <w:spacing w:before="200" w:after="0"/>
+      <w:spacing w:before="160" w:after="80" w:line="264" w:lineRule="auto"/>
       <w:outlineLvl w:val="2"/>
     </w:pPr>
     <w:rPr>
-      <w:rFonts w:asciiTheme="majorHAnsi" w:eastAsiaTheme="majorEastAsia" w:hAnsiTheme="majorHAnsi" w:cstheme="majorBidi" w:ascii="Arial" w:hAnsi="Arial"/>
+      <w:rFonts w:asciiTheme="majorHAnsi" w:eastAsiaTheme="majorEastAsia" w:hAnsiTheme="majorHAnsi" w:cstheme="majorBidi" w:ascii="Calibri" w:hAnsi="Calibri"/>
       <w:b/>
       <w:bCs/>
-      <w:color w:val="4F81BD" w:themeColor="accent1"/>
+      <w:color w:val="1F4D78"/>
       <w:sz w:val="24"/>
     </w:rPr>
   </w:style>
@@ -5298,8 +6090,14 @@
       <w:numPr>
         <w:numId w:val="1"/>
       </w:numPr>
+      <w:spacing w:after="160" w:line="280" w:lineRule="auto"/>
+      <w:ind w:left="720" w:hanging="360"/>
       <w:contextualSpacing/>
     </w:pPr>
+    <w:rPr>
+      <w:rFonts w:ascii="Calibri" w:hAnsi="Calibri"/>
+      <w:sz w:val="22"/>
+    </w:rPr>
   </w:style>
   <w:style w:type="paragraph" w:styleId="ListBullet2">
     <w:name w:val="List Bullet 2"/>
@@ -5337,8 +6135,14 @@
       <w:numPr>
         <w:numId w:val="5"/>
       </w:numPr>
+      <w:spacing w:after="160" w:line="280" w:lineRule="auto"/>
+      <w:ind w:left="720" w:hanging="360"/>
       <w:contextualSpacing/>
     </w:pPr>
+    <w:rPr>
+      <w:rFonts w:ascii="Calibri" w:hAnsi="Calibri"/>
+      <w:sz w:val="22"/>
+    </w:rPr>
   </w:style>
   <w:style w:type="paragraph" w:styleId="ListNumber2">
     <w:name w:val="List Number 2"/>
@@ -16453,6 +17257,29 @@
         <w:shd w:val="clear" w:color="auto" w:fill="FBCAA2" w:themeFill="accent6" w:themeFillTint="7F"/>
       </w:tcPr>
     </w:tblStylePr>
+  </w:style>
+  <w:style w:type="paragraph" w:customStyle="1" w:styleId="CodeBlock">
+    <w:name w:val="CodeBlock"/>
+    <w:pPr>
+      <w:spacing w:before="60" w:after="120" w:line="240" w:lineRule="auto"/>
+      <w:ind w:left="115" w:right="115"/>
+    </w:pPr>
+    <w:rPr>
+      <w:rFonts w:ascii="Consolas" w:hAnsi="Consolas"/>
+      <w:sz w:val="14"/>
+    </w:rPr>
+  </w:style>
+  <w:style w:type="paragraph" w:customStyle="1" w:styleId="Callout">
+    <w:name w:val="Callout"/>
+    <w:pPr>
+      <w:spacing w:before="80" w:after="120"/>
+    </w:pPr>
+    <w:rPr>
+      <w:rFonts w:ascii="Calibri" w:hAnsi="Calibri"/>
+      <w:i/>
+      <w:color w:val="1F3A5F"/>
+      <w:sz w:val="20"/>
+    </w:rPr>
   </w:style>
 </w:styles>
 </file>

</xml_diff>